<commit_message>
Refactor personal assessment essay for clarity and conciseness
Co-authored-by: jrpenniedpu <jrpenniedpu@gmail.com>
</commit_message>
<xml_diff>
--- a/personal_assessment.docx
+++ b/personal_assessment.docx
@@ -12,27 +12,27 @@
     </w:p>
     <w:p>
       <w:r>
-        <w:t>Being one of the first CSC 394 students to partner with an AI collaborator meant embracing a dual mandate: I spent 33.5 logged hours safeguarding the project’s security posture while keeping every teammate informed about what the AI delivered. Beginning with the September 16 kickoff meeting (2.5 hours), I volunteered to own security, set communication rhythms for our Monday check-ins, and made it clear that I would audit each AI-generated change before it landed in production.</w:t>
+        <w:t>Being one of the first CSC 394 students to lean on an AI collaborator all quarter was both exciting and a little unnerving. I logged 33.5 hours making sure our project stayed secure while everyone else could move fast. During the September 16 kickoff meeting (2.5 hours) I grabbed the security role, set up our Monday check-ins, and promised the team I would keep an eye on anything Cursor dropped into the repository.</w:t>
       </w:r>
     </w:p>
     <w:p>
       <w:r>
-        <w:t>That commitment defined the next week. On September 17 and 18 I invested two hours reviewing Cursor-written code, spotting internal logging gaps and unsafe temporary file handling before they could compromise our demo. I documented every concern, shared remediation notes with David, and then formalized our follow-up workflow by launching a Trello board during the September 23 meeting so nothing fell through the cracks.</w:t>
+        <w:t>From day one I was skeptical of AI-written code, so I built a routine around double-checking it. On September 17 and 18 I spent two hours combing through Cursor’s commits, flagged weak internal logging and sketchy temp-file handling, and ran the same snippets through ChatGPT just to see whether another model spotted anything different. By the September 23 meeting I had a Trello board in place so David and I could track every follow-up before it hit a demo.</w:t>
       </w:r>
     </w:p>
     <w:p>
       <w:r>
-        <w:t>Once the baseline was stable, I pivoted to authentication hardening. Between September 25 and October 11 (4.5 hours total) I used Cursor to benchmark CAPTCHA and reCAPTCHA options against our stack, brainstormed threat scenarios during the October 2 session, and validated the approach in smaller experiments. Those investigations fed directly into the ten-hour implementation sprint across October 24, 25, November 1, 2, 6, and 7, where I wired CAPTCHA into the refreshed UI, captured a reproducible tutorial, and scripted the security segment of our proof-of-concept videos so reviewers could see defenses in action.</w:t>
+        <w:t>Mid-quarter I dove headfirst into authentication. Between September 25 and October 11 (4.5 hours) I used Cursor to research CAPTCHA versus reCAPTCHA, tested quick prototypes, and kept the October 2 group brainstorm grounded in real attack paths. That homework turned into a ten-hour push across October 24, 25, November 1, 2, 6, and 7, where I wired the CAPTCHA flow into our refreshed UI, recorded a security explainer for the proof-of-concept video, and made sure every change lined up with our threat model.</w:t>
       </w:r>
     </w:p>
     <w:p>
       <w:r>
-        <w:t>Documentation became the multiplier for that work. Drawing on 8.5 hours from October 23, 24, and November 7, I converted my lab notes into the Captcha Implementation tutorial, added a security appendix to the design documents, and expanded the project manual so classmates could extend the safeguards when they pushed features such as achievements, badges, or user accounts on October 28. Those artifacts paired Cursor prompts with human judgment, giving the team durable references instead of one-off fixes.</w:t>
+        <w:t>Outside the raw security work, I spent a lot of time teaching the rest of the team how to repeat what I did. Over October 23, 24, and November 7 (8.5 hours) I turned my lab notes into the Captcha Implementation tutorial, added my section to the design docs, and kept the project manual in sync so anyone could extend the same protections when we started talking about achievements, badges, and user accounts on October 28.</w:t>
       </w:r>
     </w:p>
     <w:p>
       <w:r>
-        <w:t>Throughout the quarter I anchored our meetings and final delivery. I led the October 21 resubmission planning call, reconvened everyone on October 25 to align documentation, and used the October 28 meeting to triage bugs. On November 4 I resubmitted a refreshed security pull request, set deadlines for final demo clips, and by the November 10 wrap-up I had rewatched the final video, verified the documents, updated the project manual with new app features, and uploaded redundant demo links so nothing could go missing. Taken together, those efforts show how disciplined security ownership, AI-assisted audits, and relentless communication gave our group a dependable backbone all quarter long.</w:t>
+        <w:t>I also stayed plugged into every meeting so people always knew where security stood. On October 21 we mapped out the midterm resubmission plan, on October 25 we checked documentation progress, and on October 28 we triaged bugs and brainstormed the next set of features. By November 4 I had a refreshed security pull request ready, clip deadlines set for the final video, and during the November 10 final check-in I rewatched the demo, confirmed the project manual matched the new app features, and uploaded redundant copies of the video so nothing would get lost. That mix of AI-assisted audits, hands-on testing, and constant communication is what let me keep the security side steady while the rest of the team pushed the product forward.</w:t>
       </w:r>
     </w:p>
     <w:sectPr>

</xml_diff>